<commit_message>
docs: manual desde la tabla de usuarios, estilo formal en blanco y negro (PDF, DOCX, marcas)
Co-Authored-By: Claude Fable 5.1 <noreply@anthropic.com>
</commit_message>
<xml_diff>
--- a/docs/MANUAL_PROCESO_CREDITO_TRABAJADOR.docx
+++ b/docs/MANUAL_PROCESO_CREDITO_TRABAJADOR.docx
@@ -7,455 +7,32 @@
         <w:pStyle w:val="Title"/>
       </w:pPr>
       <w:r>
-        <w:t>Manual del proceso: venta a crédito a un trabajador y su reflejo en FinantialTracker</w:t>
+        <w:t>MANUAL DEL PROCESO: VENTA A CRÉDITO A UN TRABAJADOR Y SU REFLEJO EN FINANTIALTRACKER</w:t>
       </w:r>
     </w:p>
-    <w:p>
-      <w:r>
-        <w:t xml:space="preserve">Sistema </w:t>
-      </w:r>
-      <w:r>
-        <w:rPr>
-          <w:b/>
-        </w:rPr>
-        <w:t>Sub Café</w:t>
-      </w:r>
-      <w:r>
-        <w:t xml:space="preserve"> (tienda del Hospital San José) + </w:t>
-      </w:r>
-      <w:r>
-        <w:rPr>
-          <w:b/>
-        </w:rPr>
-        <w:t>FinantialTracker</w:t>
-      </w:r>
-      <w:r>
-        <w:t xml:space="preserve"> (préstamos y planilla).</w:t>
-      </w:r>
-    </w:p>
-    <w:p>
-      <w:r>
-        <w:t xml:space="preserve">Ambos usan </w:t>
-      </w:r>
-      <w:r>
-        <w:rPr>
-          <w:b/>
-        </w:rPr>
-        <w:t>la misma base de datos MySQL</w:t>
-      </w:r>
-      <w:r>
-        <w:t xml:space="preserve"> (</w:t>
-      </w:r>
-      <w:r>
-        <w:rPr>
-          <w:rFonts w:ascii="Consolas" w:hAnsi="Consolas"/>
-          <w:sz w:val="19"/>
-        </w:rPr>
-        <w:t>financialtracker1</w:t>
-      </w:r>
-      <w:r>
-        <w:t>). La tienda registra la venta y la deuda;</w:t>
-      </w:r>
-    </w:p>
-    <w:p>
-      <w:r>
-        <w:t xml:space="preserve">FinantialTracker la ve al instante en su menú </w:t>
-      </w:r>
-      <w:r>
-        <w:rPr>
-          <w:b/>
-        </w:rPr>
-        <w:t>DEUDAS TIENDA</w:t>
-      </w:r>
-      <w:r>
-        <w:t>.</w:t>
-      </w:r>
-    </w:p>
-    <w:p>
-      <w:r>
-        <w:t>Fecha de las capturas: 27/09/2026. Todas las pantallas son reales, tomadas con datos de prueba.</w:t>
-      </w:r>
-    </w:p>
-    <w:p/>
     <w:p>
       <w:pPr>
         <w:pStyle w:val="Heading1"/>
       </w:pPr>
       <w:r>
-        <w:t>1. Cómo funciona la unión</w:t>
-      </w:r>
-    </w:p>
-    <w:p>
-      <w:r>
-        <w:rPr>
-          <w:rFonts w:ascii="Consolas" w:hAnsi="Consolas"/>
-          <w:sz w:val="17"/>
-        </w:rPr>
-        <w:t>Tienda (Flutter)  →  Backend Spring Boot  →  MySQL financialtracker1  ←  FinantialTracker (Java)</w:t>
-        <w:br/>
-        <w:t xml:space="preserve">   POS / Deudores       http://localhost:8080/api        clientes, ventas,           menú DEUDAS TIENDA</w:t>
-        <w:br/>
-        <w:t xml:space="preserve">                                                         creditos_trabajadores       (solo lectura, vía API)</w:t>
+        <w:t>USUARIOS DE LA TIENDA</w:t>
       </w:r>
     </w:p>
     <w:tbl>
       <w:tblPr>
-        <w:tblStyle w:val="LightGrid-Accent1"/>
+        <w:tblStyle w:val="TableGrid"/>
         <w:tblW w:type="auto" w:w="0"/>
         <w:tblLook w:firstColumn="1" w:firstRow="1" w:lastColumn="0" w:lastRow="0" w:noHBand="0" w:noVBand="1" w:val="04A0"/>
       </w:tblPr>
       <w:tblGrid>
-        <w:gridCol w:w="3312"/>
-        <w:gridCol w:w="3312"/>
-        <w:gridCol w:w="3312"/>
+        <w:gridCol w:w="3408"/>
+        <w:gridCol w:w="3408"/>
+        <w:gridCol w:w="3408"/>
       </w:tblGrid>
       <w:tr>
         <w:tc>
           <w:tcPr>
-            <w:tcW w:type="dxa" w:w="3312"/>
-          </w:tcPr>
-          <w:p>
-            <w:r>
-              <w:rPr>
-                <w:b/>
-              </w:rPr>
-              <w:t>Quién compra</w:t>
-            </w:r>
-          </w:p>
-        </w:tc>
-        <w:tc>
-          <w:tcPr>
-            <w:tcW w:type="dxa" w:w="3312"/>
-          </w:tcPr>
-          <w:p>
-            <w:r>
-              <w:rPr>
-                <w:b/>
-              </w:rPr>
-              <w:t>Cómo paga</w:t>
-            </w:r>
-          </w:p>
-        </w:tc>
-        <w:tc>
-          <w:tcPr>
-            <w:tcW w:type="dxa" w:w="3312"/>
-          </w:tcPr>
-          <w:p>
-            <w:r>
-              <w:rPr>
-                <w:b/>
-              </w:rPr>
-              <w:t>Qué pasa</w:t>
-            </w:r>
-          </w:p>
-        </w:tc>
-      </w:tr>
-      <w:tr>
-        <w:tc>
-          <w:tcPr>
-            <w:tcW w:type="dxa" w:w="3312"/>
-          </w:tcPr>
-          <w:p>
-            <w:r>
-              <w:t>Cliente externo</w:t>
-            </w:r>
-          </w:p>
-        </w:tc>
-        <w:tc>
-          <w:tcPr>
-            <w:tcW w:type="dxa" w:w="3312"/>
-          </w:tcPr>
-          <w:p>
-            <w:r>
-              <w:t>Efectivo, Yape, Plin o Niubiz</w:t>
-            </w:r>
-          </w:p>
-        </w:tc>
-        <w:tc>
-          <w:tcPr>
-            <w:tcW w:type="dxa" w:w="3312"/>
-          </w:tcPr>
-          <w:p>
-            <w:r>
-              <w:t>Solo se registra la venta.</w:t>
-            </w:r>
-          </w:p>
-        </w:tc>
-      </w:tr>
-      <w:tr>
-        <w:tc>
-          <w:tcPr>
-            <w:tcW w:type="dxa" w:w="3312"/>
-          </w:tcPr>
-          <w:p>
-            <w:r>
-              <w:t>Trabajador del hospital</w:t>
-            </w:r>
-          </w:p>
-        </w:tc>
-        <w:tc>
-          <w:tcPr>
-            <w:tcW w:type="dxa" w:w="3312"/>
-          </w:tcPr>
-          <w:p>
-            <w:r>
-              <w:rPr>
-                <w:b/>
-              </w:rPr>
-              <w:t>Crédito a trabajador</w:t>
-            </w:r>
-          </w:p>
-        </w:tc>
-        <w:tc>
-          <w:tcPr>
-            <w:tcW w:type="dxa" w:w="3312"/>
-          </w:tcPr>
-          <w:p>
-            <w:r>
-              <w:t xml:space="preserve">Se registra la venta </w:t>
-            </w:r>
-            <w:r>
-              <w:rPr>
-                <w:b/>
-              </w:rPr>
-              <w:t>y</w:t>
-            </w:r>
-            <w:r>
-              <w:t xml:space="preserve"> una deuda a su nombre. Aparece en Deudores y en FinantialTracker.</w:t>
-            </w:r>
-          </w:p>
-        </w:tc>
-      </w:tr>
-      <w:tr>
-        <w:tc>
-          <w:tcPr>
-            <w:tcW w:type="dxa" w:w="3312"/>
-          </w:tcPr>
-          <w:p>
-            <w:r>
-              <w:t>Trabajador del hospital</w:t>
-            </w:r>
-          </w:p>
-        </w:tc>
-        <w:tc>
-          <w:tcPr>
-            <w:tcW w:type="dxa" w:w="3312"/>
-          </w:tcPr>
-          <w:p>
-            <w:r>
-              <w:t>Al contado, identificándose</w:t>
-            </w:r>
-          </w:p>
-        </w:tc>
-        <w:tc>
-          <w:tcPr>
-            <w:tcW w:type="dxa" w:w="3312"/>
-          </w:tcPr>
-          <w:p>
-            <w:r>
-              <w:t xml:space="preserve">Se registra la venta y </w:t>
-            </w:r>
-            <w:r>
-              <w:rPr>
-                <w:b/>
-              </w:rPr>
-              <w:t>suma puntos</w:t>
-            </w:r>
-            <w:r>
-              <w:t>.</w:t>
-            </w:r>
-          </w:p>
-        </w:tc>
-      </w:tr>
-    </w:tbl>
-    <w:p/>
-    <w:p>
-      <w:r>
-        <w:t xml:space="preserve">El padrón de trabajadores viene de FinantialTracker (tabla </w:t>
-      </w:r>
-      <w:r>
-        <w:rPr>
-          <w:rFonts w:ascii="Consolas" w:hAnsi="Consolas"/>
-          <w:sz w:val="19"/>
-        </w:rPr>
-        <w:t>employees</w:t>
-      </w:r>
-      <w:r>
-        <w:t>) y se sincroniza a la tienda con un botón.</w:t>
-      </w:r>
-    </w:p>
-    <w:p/>
-    <w:p>
-      <w:pPr>
-        <w:pStyle w:val="Heading1"/>
-      </w:pPr>
-      <w:r>
-        <w:t>2. Antes de empezar</w:t>
-      </w:r>
-    </w:p>
-    <w:p>
-      <w:pPr>
-        <w:pStyle w:val="ListNumber"/>
-      </w:pPr>
-      <w:r>
-        <w:rPr>
-          <w:b/>
-        </w:rPr>
-        <w:t>Base de datos</w:t>
-      </w:r>
-      <w:r>
-        <w:t xml:space="preserve"> (contenedor Docker </w:t>
-      </w:r>
-      <w:r>
-        <w:rPr>
-          <w:rFonts w:ascii="Consolas" w:hAnsi="Consolas"/>
-          <w:sz w:val="19"/>
-        </w:rPr>
-        <w:t>mysql-proyectos</w:t>
-      </w:r>
-      <w:r>
-        <w:t>):</w:t>
-      </w:r>
-    </w:p>
-    <w:p>
-      <w:r>
-        <w:t xml:space="preserve">   </w:t>
-      </w:r>
-      <w:r>
-        <w:rPr>
-          <w:rFonts w:ascii="Consolas" w:hAnsi="Consolas"/>
-          <w:sz w:val="19"/>
-        </w:rPr>
-        <w:t>cd ~/Desktop/me/mysql-db &amp;&amp; docker compose up -d</w:t>
-      </w:r>
-    </w:p>
-    <w:p>
-      <w:pPr>
-        <w:pStyle w:val="ListNumber"/>
-      </w:pPr>
-      <w:r>
-        <w:rPr>
-          <w:b/>
-        </w:rPr>
-        <w:t>Backend de la tienda</w:t>
-      </w:r>
-      <w:r>
-        <w:t>:</w:t>
-      </w:r>
-    </w:p>
-    <w:p>
-      <w:r>
-        <w:t xml:space="preserve">   </w:t>
-      </w:r>
-      <w:r>
-        <w:rPr>
-          <w:rFonts w:ascii="Consolas" w:hAnsi="Consolas"/>
-          <w:sz w:val="19"/>
-        </w:rPr>
-        <w:t>cd ~/Desktop/me/store_subcafe/backend &amp;&amp; ./run.sh</w:t>
-      </w:r>
-      <w:r>
-        <w:t xml:space="preserve"> (Windows: </w:t>
-      </w:r>
-      <w:r>
-        <w:rPr>
-          <w:rFonts w:ascii="Consolas" w:hAnsi="Consolas"/>
-          <w:sz w:val="19"/>
-        </w:rPr>
-        <w:t>run.cmd</w:t>
-      </w:r>
-      <w:r>
-        <w:t xml:space="preserve">). Listo cuando aparece </w:t>
-      </w:r>
-      <w:r>
-        <w:rPr>
-          <w:rFonts w:ascii="Consolas" w:hAnsi="Consolas"/>
-          <w:sz w:val="19"/>
-        </w:rPr>
-        <w:t>Started GestionBodegaApplication</w:t>
-      </w:r>
-      <w:r>
-        <w:t>.</w:t>
-      </w:r>
-    </w:p>
-    <w:p>
-      <w:pPr>
-        <w:pStyle w:val="ListNumber"/>
-      </w:pPr>
-      <w:r>
-        <w:rPr>
-          <w:b/>
-        </w:rPr>
-        <w:t>App de la tienda</w:t>
-      </w:r>
-      <w:r>
-        <w:t xml:space="preserve"> (Flutter): </w:t>
-      </w:r>
-      <w:r>
-        <w:rPr>
-          <w:rFonts w:ascii="Consolas" w:hAnsi="Consolas"/>
-          <w:sz w:val="19"/>
-        </w:rPr>
-        <w:t>flutter run -d windows</w:t>
-      </w:r>
-      <w:r>
-        <w:t xml:space="preserve"> o </w:t>
-      </w:r>
-      <w:r>
-        <w:rPr>
-          <w:rFonts w:ascii="Consolas" w:hAnsi="Consolas"/>
-          <w:sz w:val="19"/>
-        </w:rPr>
-        <w:t>flutter run -d chrome</w:t>
-      </w:r>
-      <w:r>
-        <w:t>.</w:t>
-      </w:r>
-    </w:p>
-    <w:p>
-      <w:pPr>
-        <w:pStyle w:val="ListNumber"/>
-      </w:pPr>
-      <w:r>
-        <w:rPr>
-          <w:b/>
-        </w:rPr>
-        <w:t>FinantialTracker</w:t>
-      </w:r>
-      <w:r>
-        <w:t xml:space="preserve"> (Java): abrir desde NetBeans o el </w:t>
-      </w:r>
-      <w:r>
-        <w:rPr>
-          <w:rFonts w:ascii="Consolas" w:hAnsi="Consolas"/>
-          <w:sz w:val="19"/>
-        </w:rPr>
-        <w:t>.exe</w:t>
-      </w:r>
-      <w:r>
-        <w:t>. Necesita el backend de la tienda encendido para el menú DEUDAS TIENDA.</w:t>
-      </w:r>
-    </w:p>
-    <w:p>
-      <w:r>
-        <w:t>Usuarios de la tienda (los del seed; cambiarlos en producción):</w:t>
-      </w:r>
-    </w:p>
-    <w:tbl>
-      <w:tblPr>
-        <w:tblStyle w:val="LightGrid-Accent1"/>
-        <w:tblW w:type="auto" w:w="0"/>
-        <w:tblLook w:firstColumn="1" w:firstRow="1" w:lastColumn="0" w:lastRow="0" w:noHBand="0" w:noVBand="1" w:val="04A0"/>
-      </w:tblPr>
-      <w:tblGrid>
-        <w:gridCol w:w="3312"/>
-        <w:gridCol w:w="3312"/>
-        <w:gridCol w:w="3312"/>
-      </w:tblGrid>
-      <w:tr>
-        <w:tc>
-          <w:tcPr>
-            <w:tcW w:type="dxa" w:w="3312"/>
+            <w:tcW w:type="dxa" w:w="3408"/>
           </w:tcPr>
           <w:p>
             <w:r>
@@ -468,7 +45,7 @@
         </w:tc>
         <w:tc>
           <w:tcPr>
-            <w:tcW w:type="dxa" w:w="3312"/>
+            <w:tcW w:type="dxa" w:w="3408"/>
           </w:tcPr>
           <w:p>
             <w:r>
@@ -481,7 +58,7 @@
         </w:tc>
         <w:tc>
           <w:tcPr>
-            <w:tcW w:type="dxa" w:w="3312"/>
+            <w:tcW w:type="dxa" w:w="3408"/>
           </w:tcPr>
           <w:p>
             <w:r>
@@ -496,13 +73,13 @@
       <w:tr>
         <w:tc>
           <w:tcPr>
-            <w:tcW w:type="dxa" w:w="3312"/>
+            <w:tcW w:type="dxa" w:w="3408"/>
           </w:tcPr>
           <w:p>
             <w:r>
               <w:rPr>
-                <w:rFonts w:ascii="Consolas" w:hAnsi="Consolas"/>
-                <w:sz w:val="19"/>
+                <w:rFonts w:ascii="Courier New" w:hAnsi="Courier New"/>
+                <w:sz w:val="20"/>
               </w:rPr>
               <w:t>admin</w:t>
             </w:r>
@@ -510,13 +87,13 @@
         </w:tc>
         <w:tc>
           <w:tcPr>
-            <w:tcW w:type="dxa" w:w="3312"/>
+            <w:tcW w:type="dxa" w:w="3408"/>
           </w:tcPr>
           <w:p>
             <w:r>
               <w:rPr>
-                <w:rFonts w:ascii="Consolas" w:hAnsi="Consolas"/>
-                <w:sz w:val="19"/>
+                <w:rFonts w:ascii="Courier New" w:hAnsi="Courier New"/>
+                <w:sz w:val="20"/>
               </w:rPr>
               <w:t>admin123</w:t>
             </w:r>
@@ -524,7 +101,7 @@
         </w:tc>
         <w:tc>
           <w:tcPr>
-            <w:tcW w:type="dxa" w:w="3312"/>
+            <w:tcW w:type="dxa" w:w="3408"/>
           </w:tcPr>
           <w:p>
             <w:r>
@@ -536,13 +113,13 @@
       <w:tr>
         <w:tc>
           <w:tcPr>
-            <w:tcW w:type="dxa" w:w="3312"/>
+            <w:tcW w:type="dxa" w:w="3408"/>
           </w:tcPr>
           <w:p>
             <w:r>
               <w:rPr>
-                <w:rFonts w:ascii="Consolas" w:hAnsi="Consolas"/>
-                <w:sz w:val="19"/>
+                <w:rFonts w:ascii="Courier New" w:hAnsi="Courier New"/>
+                <w:sz w:val="20"/>
               </w:rPr>
               <w:t>encargado1</w:t>
             </w:r>
@@ -550,13 +127,13 @@
         </w:tc>
         <w:tc>
           <w:tcPr>
-            <w:tcW w:type="dxa" w:w="3312"/>
+            <w:tcW w:type="dxa" w:w="3408"/>
           </w:tcPr>
           <w:p>
             <w:r>
               <w:rPr>
-                <w:rFonts w:ascii="Consolas" w:hAnsi="Consolas"/>
-                <w:sz w:val="19"/>
+                <w:rFonts w:ascii="Courier New" w:hAnsi="Courier New"/>
+                <w:sz w:val="20"/>
               </w:rPr>
               <w:t>admin123</w:t>
             </w:r>
@@ -564,7 +141,7 @@
         </w:tc>
         <w:tc>
           <w:tcPr>
-            <w:tcW w:type="dxa" w:w="3312"/>
+            <w:tcW w:type="dxa" w:w="3408"/>
           </w:tcPr>
           <w:p>
             <w:r>
@@ -576,13 +153,13 @@
       <w:tr>
         <w:tc>
           <w:tcPr>
-            <w:tcW w:type="dxa" w:w="3312"/>
+            <w:tcW w:type="dxa" w:w="3408"/>
           </w:tcPr>
           <w:p>
             <w:r>
               <w:rPr>
-                <w:rFonts w:ascii="Consolas" w:hAnsi="Consolas"/>
-                <w:sz w:val="19"/>
+                <w:rFonts w:ascii="Courier New" w:hAnsi="Courier New"/>
+                <w:sz w:val="20"/>
               </w:rPr>
               <w:t>vendedor1</w:t>
             </w:r>
@@ -590,13 +167,13 @@
         </w:tc>
         <w:tc>
           <w:tcPr>
-            <w:tcW w:type="dxa" w:w="3312"/>
+            <w:tcW w:type="dxa" w:w="3408"/>
           </w:tcPr>
           <w:p>
             <w:r>
               <w:rPr>
-                <w:rFonts w:ascii="Consolas" w:hAnsi="Consolas"/>
-                <w:sz w:val="19"/>
+                <w:rFonts w:ascii="Courier New" w:hAnsi="Courier New"/>
+                <w:sz w:val="20"/>
               </w:rPr>
               <w:t>admin123</w:t>
             </w:r>
@@ -604,7 +181,7 @@
         </w:tc>
         <w:tc>
           <w:tcPr>
-            <w:tcW w:type="dxa" w:w="3312"/>
+            <w:tcW w:type="dxa" w:w="3408"/>
           </w:tcPr>
           <w:p>
             <w:r>
@@ -621,7 +198,12 @@
         <w:pStyle w:val="Heading1"/>
       </w:pPr>
       <w:r>
-        <w:t>3. Paso a paso</w:t>
+        <w:t>1. PASO A PASO</w:t>
+      </w:r>
+    </w:p>
+    <w:p>
+      <w:r>
+        <w:br w:type="page"/>
       </w:r>
     </w:p>
     <w:p>
@@ -639,7 +221,7 @@
       <w:r>
         <w:drawing>
           <wp:inline xmlns:a="http://schemas.openxmlformats.org/drawingml/2006/main" xmlns:pic="http://schemas.openxmlformats.org/drawingml/2006/picture">
-            <wp:extent cx="6035040" cy="3771900"/>
+            <wp:extent cx="6217920" cy="3886200"/>
             <wp:docPr id="1" name="Picture 1"/>
             <wp:cNvGraphicFramePr>
               <a:graphicFrameLocks noChangeAspect="1"/>
@@ -660,7 +242,7 @@
                   <pic:spPr>
                     <a:xfrm>
                       <a:off x="0" y="0"/>
-                      <a:ext cx="6035040" cy="3771900"/>
+                      <a:ext cx="6217920" cy="3886200"/>
                     </a:xfrm>
                     <a:prstGeom prst="rect"/>
                   </pic:spPr>
@@ -689,8 +271,8 @@
       </w:r>
       <w:r>
         <w:rPr>
-          <w:rFonts w:ascii="Consolas" w:hAnsi="Consolas"/>
-          <w:sz w:val="19"/>
+          <w:rFonts w:ascii="Courier New" w:hAnsi="Courier New"/>
+          <w:sz w:val="20"/>
         </w:rPr>
         <w:t>admin</w:t>
       </w:r>
@@ -733,6 +315,11 @@
       </w:r>
     </w:p>
     <w:p>
+      <w:r>
+        <w:br w:type="page"/>
+      </w:r>
+    </w:p>
+    <w:p>
       <w:pPr>
         <w:pStyle w:val="Heading2"/>
       </w:pPr>
@@ -761,7 +348,7 @@
       <w:r>
         <w:drawing>
           <wp:inline xmlns:a="http://schemas.openxmlformats.org/drawingml/2006/main" xmlns:pic="http://schemas.openxmlformats.org/drawingml/2006/picture">
-            <wp:extent cx="6035040" cy="3771900"/>
+            <wp:extent cx="6217920" cy="3886200"/>
             <wp:docPr id="2" name="Picture 2"/>
             <wp:cNvGraphicFramePr>
               <a:graphicFrameLocks noChangeAspect="1"/>
@@ -782,7 +369,7 @@
                   <pic:spPr>
                     <a:xfrm>
                       <a:off x="0" y="0"/>
-                      <a:ext cx="6035040" cy="3771900"/>
+                      <a:ext cx="6217920" cy="3886200"/>
                     </a:xfrm>
                     <a:prstGeom prst="rect"/>
                   </pic:spPr>
@@ -847,6 +434,11 @@
       </w:r>
     </w:p>
     <w:p>
+      <w:r>
+        <w:br w:type="page"/>
+      </w:r>
+    </w:p>
+    <w:p>
       <w:pPr>
         <w:pStyle w:val="Heading2"/>
       </w:pPr>
@@ -861,7 +453,7 @@
       <w:r>
         <w:drawing>
           <wp:inline xmlns:a="http://schemas.openxmlformats.org/drawingml/2006/main" xmlns:pic="http://schemas.openxmlformats.org/drawingml/2006/picture">
-            <wp:extent cx="6035040" cy="3771900"/>
+            <wp:extent cx="6217920" cy="3886200"/>
             <wp:docPr id="3" name="Picture 3"/>
             <wp:cNvGraphicFramePr>
               <a:graphicFrameLocks noChangeAspect="1"/>
@@ -882,7 +474,7 @@
                   <pic:spPr>
                     <a:xfrm>
                       <a:off x="0" y="0"/>
-                      <a:ext cx="6035040" cy="3771900"/>
+                      <a:ext cx="6217920" cy="3886200"/>
                     </a:xfrm>
                     <a:prstGeom prst="rect"/>
                   </pic:spPr>
@@ -937,13 +529,18 @@
       </w:r>
       <w:r>
         <w:rPr>
-          <w:rFonts w:ascii="Consolas" w:hAnsi="Consolas"/>
-          <w:sz w:val="19"/>
+          <w:rFonts w:ascii="Courier New" w:hAnsi="Courier New"/>
+          <w:sz w:val="20"/>
         </w:rPr>
         <w:t>empleado_id</w:t>
       </w:r>
       <w:r>
         <w:t>). Solo los trabajadores pueden comprar a crédito, recibir vales y acumular puntos.</w:t>
+      </w:r>
+    </w:p>
+    <w:p>
+      <w:r>
+        <w:br w:type="page"/>
       </w:r>
     </w:p>
     <w:p>
@@ -969,7 +566,7 @@
       <w:r>
         <w:drawing>
           <wp:inline xmlns:a="http://schemas.openxmlformats.org/drawingml/2006/main" xmlns:pic="http://schemas.openxmlformats.org/drawingml/2006/picture">
-            <wp:extent cx="6035040" cy="3771900"/>
+            <wp:extent cx="6217920" cy="3886200"/>
             <wp:docPr id="4" name="Picture 4"/>
             <wp:cNvGraphicFramePr>
               <a:graphicFrameLocks noChangeAspect="1"/>
@@ -990,7 +587,7 @@
                   <pic:spPr>
                     <a:xfrm>
                       <a:off x="0" y="0"/>
-                      <a:ext cx="6035040" cy="3771900"/>
+                      <a:ext cx="6217920" cy="3886200"/>
                     </a:xfrm>
                     <a:prstGeom prst="rect"/>
                   </pic:spPr>
@@ -1077,7 +674,7 @@
       <w:r>
         <w:drawing>
           <wp:inline xmlns:a="http://schemas.openxmlformats.org/drawingml/2006/main" xmlns:pic="http://schemas.openxmlformats.org/drawingml/2006/picture">
-            <wp:extent cx="6035040" cy="3771900"/>
+            <wp:extent cx="6217920" cy="3886200"/>
             <wp:docPr id="5" name="Picture 5"/>
             <wp:cNvGraphicFramePr>
               <a:graphicFrameLocks noChangeAspect="1"/>
@@ -1098,7 +695,7 @@
                   <pic:spPr>
                     <a:xfrm>
                       <a:off x="0" y="0"/>
-                      <a:ext cx="6035040" cy="3771900"/>
+                      <a:ext cx="6217920" cy="3886200"/>
                     </a:xfrm>
                     <a:prstGeom prst="rect"/>
                   </pic:spPr>
@@ -1162,7 +759,7 @@
       <w:r>
         <w:drawing>
           <wp:inline xmlns:a="http://schemas.openxmlformats.org/drawingml/2006/main" xmlns:pic="http://schemas.openxmlformats.org/drawingml/2006/picture">
-            <wp:extent cx="6035040" cy="3771900"/>
+            <wp:extent cx="6217920" cy="3886200"/>
             <wp:docPr id="6" name="Picture 6"/>
             <wp:cNvGraphicFramePr>
               <a:graphicFrameLocks noChangeAspect="1"/>
@@ -1183,7 +780,7 @@
                   <pic:spPr>
                     <a:xfrm>
                       <a:off x="0" y="0"/>
-                      <a:ext cx="6035040" cy="3771900"/>
+                      <a:ext cx="6217920" cy="3886200"/>
                     </a:xfrm>
                     <a:prstGeom prst="rect"/>
                   </pic:spPr>
@@ -1231,7 +828,7 @@
       <w:r>
         <w:drawing>
           <wp:inline xmlns:a="http://schemas.openxmlformats.org/drawingml/2006/main" xmlns:pic="http://schemas.openxmlformats.org/drawingml/2006/picture">
-            <wp:extent cx="6035040" cy="3771900"/>
+            <wp:extent cx="6217920" cy="3886200"/>
             <wp:docPr id="7" name="Picture 7"/>
             <wp:cNvGraphicFramePr>
               <a:graphicFrameLocks noChangeAspect="1"/>
@@ -1252,7 +849,7 @@
                   <pic:spPr>
                     <a:xfrm>
                       <a:off x="0" y="0"/>
-                      <a:ext cx="6035040" cy="3771900"/>
+                      <a:ext cx="6217920" cy="3886200"/>
                     </a:xfrm>
                     <a:prstGeom prst="rect"/>
                   </pic:spPr>
@@ -1295,7 +892,7 @@
       <w:r>
         <w:drawing>
           <wp:inline xmlns:a="http://schemas.openxmlformats.org/drawingml/2006/main" xmlns:pic="http://schemas.openxmlformats.org/drawingml/2006/picture">
-            <wp:extent cx="6035040" cy="3771900"/>
+            <wp:extent cx="6217920" cy="3886200"/>
             <wp:docPr id="8" name="Picture 8"/>
             <wp:cNvGraphicFramePr>
               <a:graphicFrameLocks noChangeAspect="1"/>
@@ -1316,7 +913,7 @@
                   <pic:spPr>
                     <a:xfrm>
                       <a:off x="0" y="0"/>
-                      <a:ext cx="6035040" cy="3771900"/>
+                      <a:ext cx="6217920" cy="3886200"/>
                     </a:xfrm>
                     <a:prstGeom prst="rect"/>
                   </pic:spPr>
@@ -1351,7 +948,7 @@
       <w:r>
         <w:drawing>
           <wp:inline xmlns:a="http://schemas.openxmlformats.org/drawingml/2006/main" xmlns:pic="http://schemas.openxmlformats.org/drawingml/2006/picture">
-            <wp:extent cx="6035040" cy="3771900"/>
+            <wp:extent cx="6217920" cy="3886200"/>
             <wp:docPr id="9" name="Picture 9"/>
             <wp:cNvGraphicFramePr>
               <a:graphicFrameLocks noChangeAspect="1"/>
@@ -1372,7 +969,7 @@
                   <pic:spPr>
                     <a:xfrm>
                       <a:off x="0" y="0"/>
-                      <a:ext cx="6035040" cy="3771900"/>
+                      <a:ext cx="6217920" cy="3886200"/>
                     </a:xfrm>
                     <a:prstGeom prst="rect"/>
                   </pic:spPr>
@@ -1398,7 +995,7 @@
       <w:r>
         <w:drawing>
           <wp:inline xmlns:a="http://schemas.openxmlformats.org/drawingml/2006/main" xmlns:pic="http://schemas.openxmlformats.org/drawingml/2006/picture">
-            <wp:extent cx="6035040" cy="3771900"/>
+            <wp:extent cx="6217920" cy="3886200"/>
             <wp:docPr id="10" name="Picture 10"/>
             <wp:cNvGraphicFramePr>
               <a:graphicFrameLocks noChangeAspect="1"/>
@@ -1419,7 +1016,7 @@
                   <pic:spPr>
                     <a:xfrm>
                       <a:off x="0" y="0"/>
-                      <a:ext cx="6035040" cy="3771900"/>
+                      <a:ext cx="6217920" cy="3886200"/>
                     </a:xfrm>
                     <a:prstGeom prst="rect"/>
                   </pic:spPr>
@@ -1472,7 +1069,7 @@
       <w:r>
         <w:drawing>
           <wp:inline xmlns:a="http://schemas.openxmlformats.org/drawingml/2006/main" xmlns:pic="http://schemas.openxmlformats.org/drawingml/2006/picture">
-            <wp:extent cx="6035040" cy="3771900"/>
+            <wp:extent cx="6217920" cy="3886200"/>
             <wp:docPr id="11" name="Picture 11"/>
             <wp:cNvGraphicFramePr>
               <a:graphicFrameLocks noChangeAspect="1"/>
@@ -1493,7 +1090,7 @@
                   <pic:spPr>
                     <a:xfrm>
                       <a:off x="0" y="0"/>
-                      <a:ext cx="6035040" cy="3771900"/>
+                      <a:ext cx="6217920" cy="3886200"/>
                     </a:xfrm>
                     <a:prstGeom prst="rect"/>
                   </pic:spPr>
@@ -1550,7 +1147,7 @@
       <w:r>
         <w:drawing>
           <wp:inline xmlns:a="http://schemas.openxmlformats.org/drawingml/2006/main" xmlns:pic="http://schemas.openxmlformats.org/drawingml/2006/picture">
-            <wp:extent cx="6035040" cy="3771900"/>
+            <wp:extent cx="6217920" cy="3886200"/>
             <wp:docPr id="12" name="Picture 12"/>
             <wp:cNvGraphicFramePr>
               <a:graphicFrameLocks noChangeAspect="1"/>
@@ -1571,7 +1168,7 @@
                   <pic:spPr>
                     <a:xfrm>
                       <a:off x="0" y="0"/>
-                      <a:ext cx="6035040" cy="3771900"/>
+                      <a:ext cx="6217920" cy="3886200"/>
                     </a:xfrm>
                     <a:prstGeom prst="rect"/>
                   </pic:spPr>
@@ -1611,7 +1208,7 @@
       <w:r>
         <w:drawing>
           <wp:inline xmlns:a="http://schemas.openxmlformats.org/drawingml/2006/main" xmlns:pic="http://schemas.openxmlformats.org/drawingml/2006/picture">
-            <wp:extent cx="6035040" cy="3771900"/>
+            <wp:extent cx="6217920" cy="3886200"/>
             <wp:docPr id="13" name="Picture 13"/>
             <wp:cNvGraphicFramePr>
               <a:graphicFrameLocks noChangeAspect="1"/>
@@ -1632,7 +1229,7 @@
                   <pic:spPr>
                     <a:xfrm>
                       <a:off x="0" y="0"/>
-                      <a:ext cx="6035040" cy="3771900"/>
+                      <a:ext cx="6217920" cy="3886200"/>
                     </a:xfrm>
                     <a:prstGeom prst="rect"/>
                   </pic:spPr>
@@ -1696,7 +1293,7 @@
       <w:r>
         <w:drawing>
           <wp:inline xmlns:a="http://schemas.openxmlformats.org/drawingml/2006/main" xmlns:pic="http://schemas.openxmlformats.org/drawingml/2006/picture">
-            <wp:extent cx="6035040" cy="3771900"/>
+            <wp:extent cx="6217920" cy="3886200"/>
             <wp:docPr id="14" name="Picture 14"/>
             <wp:cNvGraphicFramePr>
               <a:graphicFrameLocks noChangeAspect="1"/>
@@ -1717,7 +1314,7 @@
                   <pic:spPr>
                     <a:xfrm>
                       <a:off x="0" y="0"/>
-                      <a:ext cx="6035040" cy="3771900"/>
+                      <a:ext cx="6217920" cy="3886200"/>
                     </a:xfrm>
                     <a:prstGeom prst="rect"/>
                   </pic:spPr>
@@ -1746,6 +1343,11 @@
       </w:r>
     </w:p>
     <w:p>
+      <w:r>
+        <w:br w:type="page"/>
+      </w:r>
+    </w:p>
+    <w:p>
       <w:pPr>
         <w:pStyle w:val="Heading2"/>
       </w:pPr>
@@ -1760,7 +1362,7 @@
       <w:r>
         <w:drawing>
           <wp:inline xmlns:a="http://schemas.openxmlformats.org/drawingml/2006/main" xmlns:pic="http://schemas.openxmlformats.org/drawingml/2006/picture">
-            <wp:extent cx="6035040" cy="3771900"/>
+            <wp:extent cx="6217920" cy="3886200"/>
             <wp:docPr id="15" name="Picture 15"/>
             <wp:cNvGraphicFramePr>
               <a:graphicFrameLocks noChangeAspect="1"/>
@@ -1781,7 +1383,7 @@
                   <pic:spPr>
                     <a:xfrm>
                       <a:off x="0" y="0"/>
-                      <a:ext cx="6035040" cy="3771900"/>
+                      <a:ext cx="6217920" cy="3886200"/>
                     </a:xfrm>
                     <a:prstGeom prst="rect"/>
                   </pic:spPr>
@@ -1837,7 +1439,7 @@
       <w:r>
         <w:drawing>
           <wp:inline xmlns:a="http://schemas.openxmlformats.org/drawingml/2006/main" xmlns:pic="http://schemas.openxmlformats.org/drawingml/2006/picture">
-            <wp:extent cx="6035040" cy="3771900"/>
+            <wp:extent cx="6217920" cy="3886200"/>
             <wp:docPr id="16" name="Picture 16"/>
             <wp:cNvGraphicFramePr>
               <a:graphicFrameLocks noChangeAspect="1"/>
@@ -1858,7 +1460,7 @@
                   <pic:spPr>
                     <a:xfrm>
                       <a:off x="0" y="0"/>
-                      <a:ext cx="6035040" cy="3771900"/>
+                      <a:ext cx="6217920" cy="3886200"/>
                     </a:xfrm>
                     <a:prstGeom prst="rect"/>
                   </pic:spPr>
@@ -1900,7 +1502,7 @@
       <w:r>
         <w:drawing>
           <wp:inline xmlns:a="http://schemas.openxmlformats.org/drawingml/2006/main" xmlns:pic="http://schemas.openxmlformats.org/drawingml/2006/picture">
-            <wp:extent cx="6035040" cy="3771900"/>
+            <wp:extent cx="6217920" cy="3886200"/>
             <wp:docPr id="17" name="Picture 17"/>
             <wp:cNvGraphicFramePr>
               <a:graphicFrameLocks noChangeAspect="1"/>
@@ -1921,7 +1523,7 @@
                   <pic:spPr>
                     <a:xfrm>
                       <a:off x="0" y="0"/>
-                      <a:ext cx="6035040" cy="3771900"/>
+                      <a:ext cx="6217920" cy="3886200"/>
                     </a:xfrm>
                     <a:prstGeom prst="rect"/>
                   </pic:spPr>
@@ -1963,6 +1565,11 @@
       </w:r>
     </w:p>
     <w:p>
+      <w:r>
+        <w:br w:type="page"/>
+      </w:r>
+    </w:p>
+    <w:p>
       <w:pPr>
         <w:pStyle w:val="Heading2"/>
       </w:pPr>
@@ -1977,7 +1584,7 @@
       <w:r>
         <w:drawing>
           <wp:inline xmlns:a="http://schemas.openxmlformats.org/drawingml/2006/main" xmlns:pic="http://schemas.openxmlformats.org/drawingml/2006/picture">
-            <wp:extent cx="6035040" cy="3771900"/>
+            <wp:extent cx="6217920" cy="3886200"/>
             <wp:docPr id="18" name="Picture 18"/>
             <wp:cNvGraphicFramePr>
               <a:graphicFrameLocks noChangeAspect="1"/>
@@ -1998,7 +1605,7 @@
                   <pic:spPr>
                     <a:xfrm>
                       <a:off x="0" y="0"/>
-                      <a:ext cx="6035040" cy="3771900"/>
+                      <a:ext cx="6217920" cy="3886200"/>
                     </a:xfrm>
                     <a:prstGeom prst="rect"/>
                   </pic:spPr>
@@ -2065,8 +1672,8 @@
       </w:r>
       <w:r>
         <w:rPr>
-          <w:rFonts w:ascii="Consolas" w:hAnsi="Consolas"/>
-          <w:sz w:val="19"/>
+          <w:rFonts w:ascii="Courier New" w:hAnsi="Courier New"/>
+          <w:sz w:val="20"/>
         </w:rPr>
         <w:t>cierre_creditos_detalle</w:t>
       </w:r>
@@ -2083,8 +1690,8 @@
       </w:r>
       <w:r>
         <w:rPr>
-          <w:rFonts w:ascii="Consolas" w:hAnsi="Consolas"/>
-          <w:sz w:val="19"/>
+          <w:rFonts w:ascii="Courier New" w:hAnsi="Courier New"/>
+          <w:sz w:val="20"/>
         </w:rPr>
         <w:t>abono</w:t>
       </w:r>
@@ -2111,13 +1718,18 @@
       </w:r>
       <w:r>
         <w:rPr>
-          <w:rFonts w:ascii="Consolas" w:hAnsi="Consolas"/>
-          <w:sz w:val="19"/>
+          <w:rFonts w:ascii="Courier New" w:hAnsi="Courier New"/>
+          <w:sz w:val="20"/>
         </w:rPr>
         <w:t>finantial.exportar_al_cerrar = true</w:t>
       </w:r>
       <w:r>
         <w:t xml:space="preserve"> en Configuración cuando se decida unir el descuento.</w:t>
+      </w:r>
+    </w:p>
+    <w:p>
+      <w:r>
+        <w:br w:type="page"/>
       </w:r>
     </w:p>
     <w:p>
@@ -2135,7 +1747,7 @@
       <w:r>
         <w:drawing>
           <wp:inline xmlns:a="http://schemas.openxmlformats.org/drawingml/2006/main" xmlns:pic="http://schemas.openxmlformats.org/drawingml/2006/picture">
-            <wp:extent cx="6035040" cy="3451288"/>
+            <wp:extent cx="6217920" cy="3555873"/>
             <wp:docPr id="19" name="Picture 19"/>
             <wp:cNvGraphicFramePr>
               <a:graphicFrameLocks noChangeAspect="1"/>
@@ -2156,7 +1768,7 @@
                   <pic:spPr>
                     <a:xfrm>
                       <a:off x="0" y="0"/>
-                      <a:ext cx="6035040" cy="3451288"/>
+                      <a:ext cx="6217920" cy="3555873"/>
                     </a:xfrm>
                     <a:prstGeom prst="rect"/>
                   </pic:spPr>
@@ -2179,7 +1791,7 @@
       <w:r>
         <w:drawing>
           <wp:inline xmlns:a="http://schemas.openxmlformats.org/drawingml/2006/main" xmlns:pic="http://schemas.openxmlformats.org/drawingml/2006/picture">
-            <wp:extent cx="6035040" cy="3451288"/>
+            <wp:extent cx="6217920" cy="3555873"/>
             <wp:docPr id="20" name="Picture 20"/>
             <wp:cNvGraphicFramePr>
               <a:graphicFrameLocks noChangeAspect="1"/>
@@ -2200,7 +1812,7 @@
                   <pic:spPr>
                     <a:xfrm>
                       <a:off x="0" y="0"/>
-                      <a:ext cx="6035040" cy="3451288"/>
+                      <a:ext cx="6217920" cy="3555873"/>
                     </a:xfrm>
                     <a:prstGeom prst="rect"/>
                   </pic:spPr>
@@ -2232,7 +1844,7 @@
       <w:r>
         <w:drawing>
           <wp:inline xmlns:a="http://schemas.openxmlformats.org/drawingml/2006/main" xmlns:pic="http://schemas.openxmlformats.org/drawingml/2006/picture">
-            <wp:extent cx="6035040" cy="3451288"/>
+            <wp:extent cx="6217920" cy="3555873"/>
             <wp:docPr id="21" name="Picture 21"/>
             <wp:cNvGraphicFramePr>
               <a:graphicFrameLocks noChangeAspect="1"/>
@@ -2253,7 +1865,7 @@
                   <pic:spPr>
                     <a:xfrm>
                       <a:off x="0" y="0"/>
-                      <a:ext cx="6035040" cy="3451288"/>
+                      <a:ext cx="6217920" cy="3555873"/>
                     </a:xfrm>
                     <a:prstGeom prst="rect"/>
                   </pic:spPr>
@@ -2318,7 +1930,7 @@
       <w:r>
         <w:drawing>
           <wp:inline xmlns:a="http://schemas.openxmlformats.org/drawingml/2006/main" xmlns:pic="http://schemas.openxmlformats.org/drawingml/2006/picture">
-            <wp:extent cx="6035040" cy="3451288"/>
+            <wp:extent cx="6217920" cy="3555873"/>
             <wp:docPr id="22" name="Picture 22"/>
             <wp:cNvGraphicFramePr>
               <a:graphicFrameLocks noChangeAspect="1"/>
@@ -2339,7 +1951,7 @@
                   <pic:spPr>
                     <a:xfrm>
                       <a:off x="0" y="0"/>
-                      <a:ext cx="6035040" cy="3451288"/>
+                      <a:ext cx="6217920" cy="3555873"/>
                     </a:xfrm>
                     <a:prstGeom prst="rect"/>
                   </pic:spPr>
@@ -2404,8 +2016,8 @@
       </w:r>
       <w:r>
         <w:rPr>
-          <w:rFonts w:ascii="Consolas" w:hAnsi="Consolas"/>
-          <w:sz w:val="19"/>
+          <w:rFonts w:ascii="Courier New" w:hAnsi="Courier New"/>
+          <w:sz w:val="20"/>
         </w:rPr>
         <w:t>http://localhost:8080/api</w:t>
       </w:r>
@@ -2419,24 +2031,24 @@
         <w:pStyle w:val="Heading1"/>
       </w:pPr>
       <w:r>
-        <w:t>4. Los demás registros de la tienda</w:t>
+        <w:t>2. LOS DEMÁS REGISTROS DE LA TIENDA</w:t>
       </w:r>
     </w:p>
     <w:tbl>
       <w:tblPr>
-        <w:tblStyle w:val="LightGrid-Accent1"/>
+        <w:tblStyle w:val="TableGrid"/>
         <w:tblW w:type="auto" w:w="0"/>
         <w:tblLook w:firstColumn="1" w:firstRow="1" w:lastColumn="0" w:lastRow="0" w:noHBand="0" w:noVBand="1" w:val="04A0"/>
       </w:tblPr>
       <w:tblGrid>
-        <w:gridCol w:w="3312"/>
-        <w:gridCol w:w="3312"/>
-        <w:gridCol w:w="3312"/>
+        <w:gridCol w:w="3408"/>
+        <w:gridCol w:w="3408"/>
+        <w:gridCol w:w="3408"/>
       </w:tblGrid>
       <w:tr>
         <w:tc>
           <w:tcPr>
-            <w:tcW w:type="dxa" w:w="3312"/>
+            <w:tcW w:type="dxa" w:w="3408"/>
           </w:tcPr>
           <w:p>
             <w:r>
@@ -2449,7 +2061,7 @@
         </w:tc>
         <w:tc>
           <w:tcPr>
-            <w:tcW w:type="dxa" w:w="3312"/>
+            <w:tcW w:type="dxa" w:w="3408"/>
           </w:tcPr>
           <w:p>
             <w:r>
@@ -2462,7 +2074,7 @@
         </w:tc>
         <w:tc>
           <w:tcPr>
-            <w:tcW w:type="dxa" w:w="3312"/>
+            <w:tcW w:type="dxa" w:w="3408"/>
           </w:tcPr>
           <w:p>
             <w:r>
@@ -2477,7 +2089,7 @@
       <w:tr>
         <w:tc>
           <w:tcPr>
-            <w:tcW w:type="dxa" w:w="3312"/>
+            <w:tcW w:type="dxa" w:w="3408"/>
           </w:tcPr>
           <w:p>
             <w:r>
@@ -2487,7 +2099,7 @@
         </w:tc>
         <w:tc>
           <w:tcPr>
-            <w:tcW w:type="dxa" w:w="3312"/>
+            <w:tcW w:type="dxa" w:w="3408"/>
           </w:tcPr>
           <w:p>
             <w:r>
@@ -2497,7 +2109,7 @@
         </w:tc>
         <w:tc>
           <w:tcPr>
-            <w:tcW w:type="dxa" w:w="3312"/>
+            <w:tcW w:type="dxa" w:w="3408"/>
           </w:tcPr>
           <w:p/>
           <w:p>
@@ -2541,7 +2153,7 @@
       <w:tr>
         <w:tc>
           <w:tcPr>
-            <w:tcW w:type="dxa" w:w="3312"/>
+            <w:tcW w:type="dxa" w:w="3408"/>
           </w:tcPr>
           <w:p>
             <w:r>
@@ -2551,7 +2163,7 @@
         </w:tc>
         <w:tc>
           <w:tcPr>
-            <w:tcW w:type="dxa" w:w="3312"/>
+            <w:tcW w:type="dxa" w:w="3408"/>
           </w:tcPr>
           <w:p>
             <w:r>
@@ -2561,7 +2173,7 @@
         </w:tc>
         <w:tc>
           <w:tcPr>
-            <w:tcW w:type="dxa" w:w="3312"/>
+            <w:tcW w:type="dxa" w:w="3408"/>
           </w:tcPr>
           <w:p/>
           <w:p>
@@ -2605,7 +2217,7 @@
       <w:tr>
         <w:tc>
           <w:tcPr>
-            <w:tcW w:type="dxa" w:w="3312"/>
+            <w:tcW w:type="dxa" w:w="3408"/>
           </w:tcPr>
           <w:p>
             <w:r>
@@ -2615,7 +2227,7 @@
         </w:tc>
         <w:tc>
           <w:tcPr>
-            <w:tcW w:type="dxa" w:w="3312"/>
+            <w:tcW w:type="dxa" w:w="3408"/>
           </w:tcPr>
           <w:p>
             <w:r>
@@ -2625,7 +2237,7 @@
         </w:tc>
         <w:tc>
           <w:tcPr>
-            <w:tcW w:type="dxa" w:w="3312"/>
+            <w:tcW w:type="dxa" w:w="3408"/>
           </w:tcPr>
           <w:p/>
           <w:p>
@@ -2741,7 +2353,7 @@
       <w:tr>
         <w:tc>
           <w:tcPr>
-            <w:tcW w:type="dxa" w:w="3312"/>
+            <w:tcW w:type="dxa" w:w="3408"/>
           </w:tcPr>
           <w:p>
             <w:r>
@@ -2751,7 +2363,7 @@
         </w:tc>
         <w:tc>
           <w:tcPr>
-            <w:tcW w:type="dxa" w:w="3312"/>
+            <w:tcW w:type="dxa" w:w="3408"/>
           </w:tcPr>
           <w:p>
             <w:r>
@@ -2761,7 +2373,7 @@
         </w:tc>
         <w:tc>
           <w:tcPr>
-            <w:tcW w:type="dxa" w:w="3312"/>
+            <w:tcW w:type="dxa" w:w="3408"/>
           </w:tcPr>
           <w:p/>
           <w:p>
@@ -2841,7 +2453,7 @@
       <w:tr>
         <w:tc>
           <w:tcPr>
-            <w:tcW w:type="dxa" w:w="3312"/>
+            <w:tcW w:type="dxa" w:w="3408"/>
           </w:tcPr>
           <w:p>
             <w:r>
@@ -2851,7 +2463,7 @@
         </w:tc>
         <w:tc>
           <w:tcPr>
-            <w:tcW w:type="dxa" w:w="3312"/>
+            <w:tcW w:type="dxa" w:w="3408"/>
           </w:tcPr>
           <w:p>
             <w:r>
@@ -2861,7 +2473,7 @@
         </w:tc>
         <w:tc>
           <w:tcPr>
-            <w:tcW w:type="dxa" w:w="3312"/>
+            <w:tcW w:type="dxa" w:w="3408"/>
           </w:tcPr>
           <w:p/>
           <w:p>
@@ -2905,7 +2517,7 @@
       <w:tr>
         <w:tc>
           <w:tcPr>
-            <w:tcW w:type="dxa" w:w="3312"/>
+            <w:tcW w:type="dxa" w:w="3408"/>
           </w:tcPr>
           <w:p>
             <w:r>
@@ -2915,7 +2527,7 @@
         </w:tc>
         <w:tc>
           <w:tcPr>
-            <w:tcW w:type="dxa" w:w="3312"/>
+            <w:tcW w:type="dxa" w:w="3408"/>
           </w:tcPr>
           <w:p>
             <w:r>
@@ -2925,7 +2537,7 @@
         </w:tc>
         <w:tc>
           <w:tcPr>
-            <w:tcW w:type="dxa" w:w="3312"/>
+            <w:tcW w:type="dxa" w:w="3408"/>
           </w:tcPr>
           <w:p/>
           <w:p>
@@ -2969,7 +2581,7 @@
       <w:tr>
         <w:tc>
           <w:tcPr>
-            <w:tcW w:type="dxa" w:w="3312"/>
+            <w:tcW w:type="dxa" w:w="3408"/>
           </w:tcPr>
           <w:p>
             <w:r>
@@ -2979,7 +2591,7 @@
         </w:tc>
         <w:tc>
           <w:tcPr>
-            <w:tcW w:type="dxa" w:w="3312"/>
+            <w:tcW w:type="dxa" w:w="3408"/>
           </w:tcPr>
           <w:p>
             <w:r>
@@ -2989,7 +2601,7 @@
         </w:tc>
         <w:tc>
           <w:tcPr>
-            <w:tcW w:type="dxa" w:w="3312"/>
+            <w:tcW w:type="dxa" w:w="3408"/>
           </w:tcPr>
           <w:p/>
           <w:p>
@@ -3033,7 +2645,7 @@
       <w:tr>
         <w:tc>
           <w:tcPr>
-            <w:tcW w:type="dxa" w:w="3312"/>
+            <w:tcW w:type="dxa" w:w="3408"/>
           </w:tcPr>
           <w:p>
             <w:r>
@@ -3043,7 +2655,7 @@
         </w:tc>
         <w:tc>
           <w:tcPr>
-            <w:tcW w:type="dxa" w:w="3312"/>
+            <w:tcW w:type="dxa" w:w="3408"/>
           </w:tcPr>
           <w:p>
             <w:r>
@@ -3053,7 +2665,7 @@
         </w:tc>
         <w:tc>
           <w:tcPr>
-            <w:tcW w:type="dxa" w:w="3312"/>
+            <w:tcW w:type="dxa" w:w="3408"/>
           </w:tcPr>
           <w:p/>
           <w:p>
@@ -3097,7 +2709,7 @@
       <w:tr>
         <w:tc>
           <w:tcPr>
-            <w:tcW w:type="dxa" w:w="3312"/>
+            <w:tcW w:type="dxa" w:w="3408"/>
           </w:tcPr>
           <w:p>
             <w:r>
@@ -3107,7 +2719,7 @@
         </w:tc>
         <w:tc>
           <w:tcPr>
-            <w:tcW w:type="dxa" w:w="3312"/>
+            <w:tcW w:type="dxa" w:w="3408"/>
           </w:tcPr>
           <w:p>
             <w:r>
@@ -3117,7 +2729,7 @@
         </w:tc>
         <w:tc>
           <w:tcPr>
-            <w:tcW w:type="dxa" w:w="3312"/>
+            <w:tcW w:type="dxa" w:w="3408"/>
           </w:tcPr>
           <w:p/>
           <w:p>
@@ -3166,7 +2778,7 @@
         <w:pStyle w:val="Heading1"/>
       </w:pPr>
       <w:r>
-        <w:t>5. Resumen del recorrido de una deuda</w:t>
+        <w:t>3. RESUMEN DEL RECORRIDO DE UNA DEUDA</w:t>
       </w:r>
     </w:p>
     <w:p>
@@ -3187,8 +2799,8 @@
       </w:r>
       <w:r>
         <w:rPr>
-          <w:rFonts w:ascii="Consolas" w:hAnsi="Consolas"/>
-          <w:sz w:val="19"/>
+          <w:rFonts w:ascii="Courier New" w:hAnsi="Courier New"/>
+          <w:sz w:val="20"/>
         </w:rPr>
         <w:t>ventas</w:t>
       </w:r>
@@ -3197,8 +2809,8 @@
       </w:r>
       <w:r>
         <w:rPr>
-          <w:rFonts w:ascii="Consolas" w:hAnsi="Consolas"/>
-          <w:sz w:val="19"/>
+          <w:rFonts w:ascii="Courier New" w:hAnsi="Courier New"/>
+          <w:sz w:val="20"/>
         </w:rPr>
         <w:t>creditos_trabajadores</w:t>
       </w:r>
@@ -3250,8 +2862,8 @@
       </w:r>
       <w:r>
         <w:rPr>
-          <w:rFonts w:ascii="Consolas" w:hAnsi="Consolas"/>
-          <w:sz w:val="19"/>
+          <w:rFonts w:ascii="Courier New" w:hAnsi="Courier New"/>
+          <w:sz w:val="20"/>
         </w:rPr>
         <w:t>deuda_trabajadores</w:t>
       </w:r>
@@ -3260,8 +2872,8 @@
       </w:r>
       <w:r>
         <w:rPr>
-          <w:rFonts w:ascii="Consolas" w:hAnsi="Consolas"/>
-          <w:sz w:val="19"/>
+          <w:rFonts w:ascii="Courier New" w:hAnsi="Courier New"/>
+          <w:sz w:val="20"/>
         </w:rPr>
         <w:t>cierre_creditos_detalle</w:t>
       </w:r>
@@ -3287,8 +2899,8 @@
       </w:r>
       <w:r>
         <w:rPr>
-          <w:rFonts w:ascii="Consolas" w:hAnsi="Consolas"/>
-          <w:sz w:val="19"/>
+          <w:rFonts w:ascii="Courier New" w:hAnsi="Courier New"/>
+          <w:sz w:val="20"/>
         </w:rPr>
         <w:t>abono.ID</w:t>
       </w:r>
@@ -3298,7 +2910,7 @@
     </w:p>
     <w:sectPr>
       <w:pgSz w:w="12240" w:h="15840"/>
-      <w:pgMar w:top="1008" w:right="1152" w:bottom="1008" w:left="1152" w:header="720" w:footer="720" w:gutter="0"/>
+      <w:pgMar w:top="1080" w:right="1008" w:bottom="1080" w:left="1008" w:header="720" w:footer="720" w:gutter="0"/>
       <w:cols w:space="720"/>
       <w:docGrid w:linePitch="360"/>
     </w:sectPr>
@@ -3670,8 +3282,9 @@
     <w:qFormat/>
     <w:rsid w:val="00FC693F"/>
     <w:rPr>
-      <w:rFonts w:ascii="Calibri" w:hAnsi="Calibri"/>
-      <w:sz w:val="21"/>
+      <w:rFonts w:ascii="Times New Roman" w:hAnsi="Times New Roman"/>
+      <w:color w:val="000000"/>
+      <w:sz w:val="22"/>
     </w:rPr>
   </w:style>
   <w:style w:type="paragraph" w:styleId="Header">
@@ -3733,11 +3346,11 @@
       <w:outlineLvl w:val="0"/>
     </w:pPr>
     <w:rPr>
-      <w:rFonts w:asciiTheme="majorHAnsi" w:eastAsiaTheme="majorEastAsia" w:hAnsiTheme="majorHAnsi" w:cstheme="majorBidi"/>
+      <w:rFonts w:asciiTheme="majorHAnsi" w:eastAsiaTheme="majorEastAsia" w:hAnsiTheme="majorHAnsi" w:cstheme="majorBidi" w:ascii="Arial" w:hAnsi="Arial"/>
       <w:b/>
       <w:bCs/>
-      <w:color w:val="365F91" w:themeColor="accent1" w:themeShade="BF"/>
-      <w:sz w:val="28"/>
+      <w:color w:val="000000"/>
+      <w:sz w:val="26"/>
       <w:szCs w:val="28"/>
     </w:rPr>
   </w:style>
@@ -3757,11 +3370,11 @@
       <w:outlineLvl w:val="1"/>
     </w:pPr>
     <w:rPr>
-      <w:rFonts w:asciiTheme="majorHAnsi" w:eastAsiaTheme="majorEastAsia" w:hAnsiTheme="majorHAnsi" w:cstheme="majorBidi"/>
+      <w:rFonts w:asciiTheme="majorHAnsi" w:eastAsiaTheme="majorEastAsia" w:hAnsiTheme="majorHAnsi" w:cstheme="majorBidi" w:ascii="Arial" w:hAnsi="Arial"/>
       <w:b/>
       <w:bCs/>
-      <w:color w:val="4F81BD" w:themeColor="accent1"/>
-      <w:sz w:val="26"/>
+      <w:color w:val="000000"/>
+      <w:sz w:val="23"/>
       <w:szCs w:val="26"/>
     </w:rPr>
   </w:style>
@@ -3781,10 +3394,11 @@
       <w:outlineLvl w:val="2"/>
     </w:pPr>
     <w:rPr>
-      <w:rFonts w:asciiTheme="majorHAnsi" w:eastAsiaTheme="majorEastAsia" w:hAnsiTheme="majorHAnsi" w:cstheme="majorBidi"/>
+      <w:rFonts w:asciiTheme="majorHAnsi" w:eastAsiaTheme="majorEastAsia" w:hAnsiTheme="majorHAnsi" w:cstheme="majorBidi" w:ascii="Arial" w:hAnsi="Arial"/>
       <w:b/>
       <w:bCs/>
-      <w:color w:val="4F81BD" w:themeColor="accent1"/>
+      <w:color w:val="000000"/>
+      <w:sz w:val="22"/>
     </w:rPr>
   </w:style>
   <w:style w:type="paragraph" w:styleId="Heading4">
@@ -4022,11 +3636,12 @@
       <w:contextualSpacing/>
     </w:pPr>
     <w:rPr>
-      <w:rFonts w:asciiTheme="majorHAnsi" w:eastAsiaTheme="majorEastAsia" w:hAnsiTheme="majorHAnsi" w:cstheme="majorBidi"/>
-      <w:color w:val="17365D" w:themeColor="text2" w:themeShade="BF"/>
+      <w:rFonts w:asciiTheme="majorHAnsi" w:eastAsiaTheme="majorEastAsia" w:hAnsiTheme="majorHAnsi" w:cstheme="majorBidi" w:ascii="Arial" w:hAnsi="Arial"/>
+      <w:b/>
+      <w:color w:val="000000"/>
       <w:spacing w:val="5"/>
       <w:kern w:val="28"/>
-      <w:sz w:val="52"/>
+      <w:sz w:val="36"/>
       <w:szCs w:val="52"/>
     </w:rPr>
   </w:style>

</xml_diff>